<commit_message>
Day 12 Lab answers Part 2
UI Actions
</commit_message>
<xml_diff>
--- a/Codes and Projects/Servicenow development/Day 12 Lab/Day 12 Lab Answers.docx
+++ b/Codes and Projects/Servicenow development/Day 12 Lab/Day 12 Lab Answers.docx
@@ -21,25 +21,7 @@
     </w:p>
     <w:p>
       <w:r>
-        <w:t>Script Include 58</w:t>
-      </w:r>
-      <w:r>
-        <w:t xml:space="preserve">, </w:t>
-      </w:r>
-      <w:r>
-        <w:t>62</w:t>
-      </w:r>
-      <w:r>
-        <w:t xml:space="preserve">, </w:t>
-      </w:r>
-      <w:r>
-        <w:t>65</w:t>
-      </w:r>
-      <w:r>
-        <w:t xml:space="preserve">, </w:t>
-      </w:r>
-      <w:r>
-        <w:t>71</w:t>
+        <w:t>Script Include 58, 62, 65, 71</w:t>
       </w:r>
     </w:p>
     <w:p>
@@ -129,6 +111,9 @@
         <w:br/>
       </w:r>
       <w:r>
+        <w:rPr>
+          <w:noProof/>
+        </w:rPr>
         <w:drawing>
           <wp:inline distT="0" distB="0" distL="0" distR="0" wp14:anchorId="74AD32F1" wp14:editId="5168D53E">
             <wp:extent cx="6858000" cy="2691765"/>
@@ -175,6 +160,9 @@
         <w:br/>
       </w:r>
       <w:r>
+        <w:rPr>
+          <w:noProof/>
+        </w:rPr>
         <w:drawing>
           <wp:inline distT="0" distB="0" distL="0" distR="0" wp14:anchorId="3B0C4E13" wp14:editId="1A686271">
             <wp:extent cx="6858000" cy="3127375"/>
@@ -245,6 +233,9 @@
         <w:br/>
       </w:r>
       <w:r>
+        <w:rPr>
+          <w:noProof/>
+        </w:rPr>
         <w:drawing>
           <wp:inline distT="0" distB="0" distL="0" distR="0" wp14:anchorId="0CF8F7E3" wp14:editId="706F256A">
             <wp:extent cx="6858000" cy="3114675"/>
@@ -295,6 +286,9 @@
         <w:br/>
       </w:r>
       <w:r>
+        <w:rPr>
+          <w:noProof/>
+        </w:rPr>
         <w:drawing>
           <wp:inline distT="0" distB="0" distL="0" distR="0" wp14:anchorId="466479E1" wp14:editId="18E95356">
             <wp:extent cx="6858000" cy="3520440"/>
@@ -358,14 +352,15 @@
       </w:r>
       <w:r>
         <w:br/>
-      </w:r>
-      <w:r>
         <w:t>Client script</w:t>
       </w:r>
       <w:r>
         <w:br/>
       </w:r>
       <w:r>
+        <w:rPr>
+          <w:noProof/>
+        </w:rPr>
         <w:drawing>
           <wp:inline distT="0" distB="0" distL="0" distR="0" wp14:anchorId="021B607E" wp14:editId="6A617012">
             <wp:extent cx="6858000" cy="3117215"/>
@@ -413,6 +408,9 @@
         <w:br/>
       </w:r>
       <w:r>
+        <w:rPr>
+          <w:noProof/>
+        </w:rPr>
         <w:drawing>
           <wp:inline distT="0" distB="0" distL="0" distR="0" wp14:anchorId="18000967" wp14:editId="2B4A6052">
             <wp:extent cx="6858000" cy="2830195"/>
@@ -490,6 +488,9 @@
         <w:br/>
       </w:r>
       <w:r>
+        <w:rPr>
+          <w:noProof/>
+        </w:rPr>
         <w:drawing>
           <wp:inline distT="0" distB="0" distL="0" distR="0" wp14:anchorId="3BD60777" wp14:editId="4C218FB1">
             <wp:extent cx="6858000" cy="3322955"/>
@@ -536,6 +537,9 @@
         <w:br/>
       </w:r>
       <w:r>
+        <w:rPr>
+          <w:noProof/>
+        </w:rPr>
         <w:drawing>
           <wp:inline distT="0" distB="0" distL="0" distR="0" wp14:anchorId="202B8A9E" wp14:editId="3FD49654">
             <wp:extent cx="6858000" cy="3571240"/>
@@ -573,9 +577,203 @@
         </w:drawing>
       </w:r>
     </w:p>
+    <w:p>
+      <w:pPr>
+        <w:pStyle w:val="Heading2"/>
+        <w:rPr>
+          <w:noProof/>
+        </w:rPr>
+      </w:pPr>
+      <w:r>
+        <w:t>UI Actions Question</w:t>
+      </w:r>
+      <w:r>
+        <w:br/>
+      </w:r>
+    </w:p>
+    <w:p>
+      <w:pPr>
+        <w:pStyle w:val="Heading2"/>
+      </w:pPr>
+      <w:r>
+        <w:rPr>
+          <w:noProof/>
+        </w:rPr>
+        <w:drawing>
+          <wp:inline distT="0" distB="0" distL="0" distR="0" wp14:anchorId="42651B42" wp14:editId="2C36E672">
+            <wp:extent cx="6858000" cy="1940560"/>
+            <wp:effectExtent l="0" t="0" r="0" b="2540"/>
+            <wp:docPr id="150374695" name="Picture 1"/>
+            <wp:cNvGraphicFramePr>
+              <a:graphicFrameLocks xmlns:a="http://schemas.openxmlformats.org/drawingml/2006/main" noChangeAspect="1"/>
+            </wp:cNvGraphicFramePr>
+            <a:graphic xmlns:a="http://schemas.openxmlformats.org/drawingml/2006/main">
+              <a:graphicData uri="http://schemas.openxmlformats.org/drawingml/2006/picture">
+                <pic:pic xmlns:pic="http://schemas.openxmlformats.org/drawingml/2006/picture">
+                  <pic:nvPicPr>
+                    <pic:cNvPr id="150374695" name=""/>
+                    <pic:cNvPicPr/>
+                  </pic:nvPicPr>
+                  <pic:blipFill>
+                    <a:blip r:embed="rId17"/>
+                    <a:stretch>
+                      <a:fillRect/>
+                    </a:stretch>
+                  </pic:blipFill>
+                  <pic:spPr>
+                    <a:xfrm>
+                      <a:off x="0" y="0"/>
+                      <a:ext cx="6858000" cy="1940560"/>
+                    </a:xfrm>
+                    <a:prstGeom prst="rect">
+                      <a:avLst/>
+                    </a:prstGeom>
+                  </pic:spPr>
+                </pic:pic>
+              </a:graphicData>
+            </a:graphic>
+          </wp:inline>
+        </w:drawing>
+      </w:r>
+      <w:r>
+        <w:br/>
+      </w:r>
+    </w:p>
+    <w:p/>
+    <w:p/>
+    <w:p/>
+    <w:p/>
+    <w:p>
+      <w:pPr>
+        <w:pStyle w:val="Heading2"/>
+      </w:pPr>
+      <w:r>
+        <w:lastRenderedPageBreak/>
+        <w:t xml:space="preserve">UI </w:t>
+      </w:r>
+      <w:r>
+        <w:t>Action 77 Answer</w:t>
+      </w:r>
+    </w:p>
+    <w:p>
+      <w:r>
+        <w:t xml:space="preserve">77. Client-side confirm before resolving Incident - Incident </w:t>
+      </w:r>
+      <w:r>
+        <w:t>–</w:t>
+      </w:r>
+      <w:r>
+        <w:t xml:space="preserve"> Easy</w:t>
+      </w:r>
+      <w:r>
+        <w:br/>
+      </w:r>
+      <w:r>
+        <w:drawing>
+          <wp:inline distT="0" distB="0" distL="0" distR="0" wp14:anchorId="68E8B1FA" wp14:editId="6020576A">
+            <wp:extent cx="6858000" cy="2823210"/>
+            <wp:effectExtent l="0" t="0" r="0" b="0"/>
+            <wp:docPr id="1121035192" name="Picture 1"/>
+            <wp:cNvGraphicFramePr>
+              <a:graphicFrameLocks xmlns:a="http://schemas.openxmlformats.org/drawingml/2006/main" noChangeAspect="1"/>
+            </wp:cNvGraphicFramePr>
+            <a:graphic xmlns:a="http://schemas.openxmlformats.org/drawingml/2006/main">
+              <a:graphicData uri="http://schemas.openxmlformats.org/drawingml/2006/picture">
+                <pic:pic xmlns:pic="http://schemas.openxmlformats.org/drawingml/2006/picture">
+                  <pic:nvPicPr>
+                    <pic:cNvPr id="1121035192" name=""/>
+                    <pic:cNvPicPr/>
+                  </pic:nvPicPr>
+                  <pic:blipFill>
+                    <a:blip r:embed="rId18"/>
+                    <a:stretch>
+                      <a:fillRect/>
+                    </a:stretch>
+                  </pic:blipFill>
+                  <pic:spPr>
+                    <a:xfrm>
+                      <a:off x="0" y="0"/>
+                      <a:ext cx="6858000" cy="2823210"/>
+                    </a:xfrm>
+                    <a:prstGeom prst="rect">
+                      <a:avLst/>
+                    </a:prstGeom>
+                  </pic:spPr>
+                </pic:pic>
+              </a:graphicData>
+            </a:graphic>
+          </wp:inline>
+        </w:drawing>
+      </w:r>
+    </w:p>
+    <w:p>
+      <w:pPr>
+        <w:pStyle w:val="Heading2"/>
+      </w:pPr>
+      <w:r>
+        <w:t xml:space="preserve">UI Action </w:t>
+      </w:r>
+      <w:r>
+        <w:t>82</w:t>
+      </w:r>
+      <w:r>
+        <w:t xml:space="preserve"> Answer</w:t>
+      </w:r>
+    </w:p>
+    <w:p>
+      <w:r>
+        <w:t xml:space="preserve">82. Client-side check for mandatory risk note before change submit - Change Request </w:t>
+      </w:r>
+      <w:r>
+        <w:t>–</w:t>
+      </w:r>
+      <w:r>
+        <w:t xml:space="preserve"> Intermediate</w:t>
+      </w:r>
+      <w:r>
+        <w:br/>
+      </w:r>
+      <w:r>
+        <w:drawing>
+          <wp:inline distT="0" distB="0" distL="0" distR="0" wp14:anchorId="74F65E58" wp14:editId="0D4A6EF2">
+            <wp:extent cx="6858000" cy="2915285"/>
+            <wp:effectExtent l="0" t="0" r="0" b="0"/>
+            <wp:docPr id="269615970" name="Picture 1"/>
+            <wp:cNvGraphicFramePr>
+              <a:graphicFrameLocks xmlns:a="http://schemas.openxmlformats.org/drawingml/2006/main" noChangeAspect="1"/>
+            </wp:cNvGraphicFramePr>
+            <a:graphic xmlns:a="http://schemas.openxmlformats.org/drawingml/2006/main">
+              <a:graphicData uri="http://schemas.openxmlformats.org/drawingml/2006/picture">
+                <pic:pic xmlns:pic="http://schemas.openxmlformats.org/drawingml/2006/picture">
+                  <pic:nvPicPr>
+                    <pic:cNvPr id="269615970" name=""/>
+                    <pic:cNvPicPr/>
+                  </pic:nvPicPr>
+                  <pic:blipFill>
+                    <a:blip r:embed="rId19"/>
+                    <a:stretch>
+                      <a:fillRect/>
+                    </a:stretch>
+                  </pic:blipFill>
+                  <pic:spPr>
+                    <a:xfrm>
+                      <a:off x="0" y="0"/>
+                      <a:ext cx="6858000" cy="2915285"/>
+                    </a:xfrm>
+                    <a:prstGeom prst="rect">
+                      <a:avLst/>
+                    </a:prstGeom>
+                  </pic:spPr>
+                </pic:pic>
+              </a:graphicData>
+            </a:graphic>
+          </wp:inline>
+        </w:drawing>
+      </w:r>
+    </w:p>
     <w:p/>
     <w:sectPr>
-      <w:footerReference w:type="default" r:id="rId17"/>
+      <w:footerReference w:type="default" r:id="rId20"/>
       <w:pgSz w:w="12240" w:h="15840"/>
       <w:pgMar w:top="720" w:right="720" w:bottom="720" w:left="720" w:header="720" w:footer="792" w:gutter="0"/>
       <w:cols w:space="720"/>
@@ -2023,7 +2221,7 @@
   <w:style w:type="paragraph" w:default="1" w:styleId="Normal">
     <w:name w:val="Normal"/>
     <w:qFormat/>
-    <w:rsid w:val="00666F9E"/>
+    <w:rsid w:val="003D34AC"/>
   </w:style>
   <w:style w:type="paragraph" w:styleId="Heading1">
     <w:name w:val="heading 1"/>

</xml_diff>

<commit_message>
Day 12 Lab answers
ITSM Part
</commit_message>
<xml_diff>
--- a/Codes and Projects/Servicenow development/Day 12 Lab/Day 12 Lab Answers.docx
+++ b/Codes and Projects/Servicenow development/Day 12 Lab/Day 12 Lab Answers.docx
@@ -649,26 +649,20 @@
       </w:pPr>
       <w:r>
         <w:lastRenderedPageBreak/>
-        <w:t xml:space="preserve">UI </w:t>
-      </w:r>
-      <w:r>
-        <w:t>Action 77 Answer</w:t>
+        <w:t>UI Action 77 Answer</w:t>
       </w:r>
     </w:p>
     <w:p>
       <w:r>
-        <w:t xml:space="preserve">77. Client-side confirm before resolving Incident - Incident </w:t>
-      </w:r>
-      <w:r>
-        <w:t>–</w:t>
-      </w:r>
-      <w:r>
-        <w:t xml:space="preserve"> Easy</w:t>
+        <w:t>77. Client-side confirm before resolving Incident - Incident – Easy</w:t>
       </w:r>
       <w:r>
         <w:br/>
       </w:r>
       <w:r>
+        <w:rPr>
+          <w:noProof/>
+        </w:rPr>
         <w:drawing>
           <wp:inline distT="0" distB="0" distL="0" distR="0" wp14:anchorId="68E8B1FA" wp14:editId="6020576A">
             <wp:extent cx="6858000" cy="2823210"/>
@@ -711,29 +705,20 @@
         <w:pStyle w:val="Heading2"/>
       </w:pPr>
       <w:r>
-        <w:t xml:space="preserve">UI Action </w:t>
-      </w:r>
-      <w:r>
-        <w:t>82</w:t>
-      </w:r>
-      <w:r>
-        <w:t xml:space="preserve"> Answer</w:t>
+        <w:t>UI Action 82 Answer</w:t>
       </w:r>
     </w:p>
     <w:p>
       <w:r>
-        <w:t xml:space="preserve">82. Client-side check for mandatory risk note before change submit - Change Request </w:t>
-      </w:r>
-      <w:r>
-        <w:t>–</w:t>
-      </w:r>
-      <w:r>
-        <w:t xml:space="preserve"> Intermediate</w:t>
+        <w:t>82. Client-side check for mandatory risk note before change submit - Change Request – Intermediate</w:t>
       </w:r>
       <w:r>
         <w:br/>
       </w:r>
       <w:r>
+        <w:rPr>
+          <w:noProof/>
+        </w:rPr>
         <w:drawing>
           <wp:inline distT="0" distB="0" distL="0" distR="0" wp14:anchorId="74F65E58" wp14:editId="0D4A6EF2">
             <wp:extent cx="6858000" cy="2915285"/>
@@ -772,8 +757,477 @@
       </w:r>
     </w:p>
     <w:p/>
+    <w:p/>
+    <w:p>
+      <w:pPr>
+        <w:pStyle w:val="Heading1"/>
+        <w:spacing w:after="0" w:line="276" w:lineRule="auto"/>
+        <w:rPr>
+          <w:sz w:val="56"/>
+          <w:szCs w:val="22"/>
+        </w:rPr>
+      </w:pPr>
+      <w:r>
+        <w:rPr>
+          <w:sz w:val="56"/>
+          <w:szCs w:val="22"/>
+        </w:rPr>
+        <w:lastRenderedPageBreak/>
+        <w:t>Day 12 Lab</w:t>
+      </w:r>
+      <w:r>
+        <w:rPr>
+          <w:sz w:val="56"/>
+          <w:szCs w:val="22"/>
+        </w:rPr>
+        <w:t xml:space="preserve"> Document Answers</w:t>
+      </w:r>
+      <w:r>
+        <w:rPr>
+          <w:sz w:val="56"/>
+          <w:szCs w:val="22"/>
+        </w:rPr>
+        <w:t xml:space="preserve"> </w:t>
+      </w:r>
+    </w:p>
+    <w:p>
+      <w:pPr>
+        <w:pStyle w:val="Heading2"/>
+      </w:pPr>
+      <w:r>
+        <w:t>Restaurant Incident Story</w:t>
+      </w:r>
+    </w:p>
+    <w:p>
+      <w:r>
+        <w:t xml:space="preserve">Incident created </w:t>
+      </w:r>
+      <w:r>
+        <w:br/>
+      </w:r>
+      <w:r>
+        <w:drawing>
+          <wp:inline distT="0" distB="0" distL="0" distR="0" wp14:anchorId="34F646F1" wp14:editId="790F14C2">
+            <wp:extent cx="6858000" cy="4053840"/>
+            <wp:effectExtent l="0" t="0" r="0" b="3810"/>
+            <wp:docPr id="1104126441" name="Picture 1"/>
+            <wp:cNvGraphicFramePr>
+              <a:graphicFrameLocks xmlns:a="http://schemas.openxmlformats.org/drawingml/2006/main" noChangeAspect="1"/>
+            </wp:cNvGraphicFramePr>
+            <a:graphic xmlns:a="http://schemas.openxmlformats.org/drawingml/2006/main">
+              <a:graphicData uri="http://schemas.openxmlformats.org/drawingml/2006/picture">
+                <pic:pic xmlns:pic="http://schemas.openxmlformats.org/drawingml/2006/picture">
+                  <pic:nvPicPr>
+                    <pic:cNvPr id="1104126441" name=""/>
+                    <pic:cNvPicPr/>
+                  </pic:nvPicPr>
+                  <pic:blipFill>
+                    <a:blip r:embed="rId20"/>
+                    <a:stretch>
+                      <a:fillRect/>
+                    </a:stretch>
+                  </pic:blipFill>
+                  <pic:spPr>
+                    <a:xfrm>
+                      <a:off x="0" y="0"/>
+                      <a:ext cx="6858000" cy="4053840"/>
+                    </a:xfrm>
+                    <a:prstGeom prst="rect">
+                      <a:avLst/>
+                    </a:prstGeom>
+                  </pic:spPr>
+                </pic:pic>
+              </a:graphicData>
+            </a:graphic>
+          </wp:inline>
+        </w:drawing>
+      </w:r>
+    </w:p>
+    <w:p>
+      <w:r>
+        <w:t xml:space="preserve">Assigned Software team to handle the issue and the incident assigned to </w:t>
+      </w:r>
+      <w:r>
+        <w:t>Beth Anglin</w:t>
+      </w:r>
+      <w:r>
+        <w:br/>
+      </w:r>
+      <w:r>
+        <w:drawing>
+          <wp:inline distT="0" distB="0" distL="0" distR="0" wp14:anchorId="48898CE6" wp14:editId="5A4B19E3">
+            <wp:extent cx="6858000" cy="1713230"/>
+            <wp:effectExtent l="0" t="0" r="0" b="1270"/>
+            <wp:docPr id="1593612690" name="Picture 1"/>
+            <wp:cNvGraphicFramePr>
+              <a:graphicFrameLocks xmlns:a="http://schemas.openxmlformats.org/drawingml/2006/main" noChangeAspect="1"/>
+            </wp:cNvGraphicFramePr>
+            <a:graphic xmlns:a="http://schemas.openxmlformats.org/drawingml/2006/main">
+              <a:graphicData uri="http://schemas.openxmlformats.org/drawingml/2006/picture">
+                <pic:pic xmlns:pic="http://schemas.openxmlformats.org/drawingml/2006/picture">
+                  <pic:nvPicPr>
+                    <pic:cNvPr id="1593612690" name=""/>
+                    <pic:cNvPicPr/>
+                  </pic:nvPicPr>
+                  <pic:blipFill>
+                    <a:blip r:embed="rId21"/>
+                    <a:stretch>
+                      <a:fillRect/>
+                    </a:stretch>
+                  </pic:blipFill>
+                  <pic:spPr>
+                    <a:xfrm>
+                      <a:off x="0" y="0"/>
+                      <a:ext cx="6858000" cy="1713230"/>
+                    </a:xfrm>
+                    <a:prstGeom prst="rect">
+                      <a:avLst/>
+                    </a:prstGeom>
+                  </pic:spPr>
+                </pic:pic>
+              </a:graphicData>
+            </a:graphic>
+          </wp:inline>
+        </w:drawing>
+      </w:r>
+      <w:r>
+        <w:br/>
+      </w:r>
+    </w:p>
+    <w:p/>
+    <w:p/>
+    <w:p>
+      <w:r>
+        <w:lastRenderedPageBreak/>
+        <w:t xml:space="preserve">Beth asked multiple questions and </w:t>
+      </w:r>
+      <w:r>
+        <w:t>waited</w:t>
+      </w:r>
+      <w:r>
+        <w:t xml:space="preserve"> for response, so she set the state on hold</w:t>
+      </w:r>
+      <w:r>
+        <w:br/>
+      </w:r>
+      <w:r>
+        <w:drawing>
+          <wp:inline distT="0" distB="0" distL="0" distR="0" wp14:anchorId="4BD2E819" wp14:editId="5D36812A">
+            <wp:extent cx="6858000" cy="2955925"/>
+            <wp:effectExtent l="0" t="0" r="0" b="0"/>
+            <wp:docPr id="1970130020" name="Picture 1"/>
+            <wp:cNvGraphicFramePr>
+              <a:graphicFrameLocks xmlns:a="http://schemas.openxmlformats.org/drawingml/2006/main" noChangeAspect="1"/>
+            </wp:cNvGraphicFramePr>
+            <a:graphic xmlns:a="http://schemas.openxmlformats.org/drawingml/2006/main">
+              <a:graphicData uri="http://schemas.openxmlformats.org/drawingml/2006/picture">
+                <pic:pic xmlns:pic="http://schemas.openxmlformats.org/drawingml/2006/picture">
+                  <pic:nvPicPr>
+                    <pic:cNvPr id="1970130020" name=""/>
+                    <pic:cNvPicPr/>
+                  </pic:nvPicPr>
+                  <pic:blipFill>
+                    <a:blip r:embed="rId22"/>
+                    <a:stretch>
+                      <a:fillRect/>
+                    </a:stretch>
+                  </pic:blipFill>
+                  <pic:spPr>
+                    <a:xfrm>
+                      <a:off x="0" y="0"/>
+                      <a:ext cx="6858000" cy="2955925"/>
+                    </a:xfrm>
+                    <a:prstGeom prst="rect">
+                      <a:avLst/>
+                    </a:prstGeom>
+                  </pic:spPr>
+                </pic:pic>
+              </a:graphicData>
+            </a:graphic>
+          </wp:inline>
+        </w:drawing>
+      </w:r>
+    </w:p>
+    <w:p>
+      <w:r>
+        <w:t>Aly replied and set the state to in progress</w:t>
+      </w:r>
+      <w:r>
+        <w:br/>
+      </w:r>
+      <w:r>
+        <w:drawing>
+          <wp:inline distT="0" distB="0" distL="0" distR="0" wp14:anchorId="68C9D2C9" wp14:editId="61D00F50">
+            <wp:extent cx="6858000" cy="2808605"/>
+            <wp:effectExtent l="0" t="0" r="0" b="0"/>
+            <wp:docPr id="656115198" name="Picture 1"/>
+            <wp:cNvGraphicFramePr>
+              <a:graphicFrameLocks xmlns:a="http://schemas.openxmlformats.org/drawingml/2006/main" noChangeAspect="1"/>
+            </wp:cNvGraphicFramePr>
+            <a:graphic xmlns:a="http://schemas.openxmlformats.org/drawingml/2006/main">
+              <a:graphicData uri="http://schemas.openxmlformats.org/drawingml/2006/picture">
+                <pic:pic xmlns:pic="http://schemas.openxmlformats.org/drawingml/2006/picture">
+                  <pic:nvPicPr>
+                    <pic:cNvPr id="656115198" name=""/>
+                    <pic:cNvPicPr/>
+                  </pic:nvPicPr>
+                  <pic:blipFill>
+                    <a:blip r:embed="rId23"/>
+                    <a:stretch>
+                      <a:fillRect/>
+                    </a:stretch>
+                  </pic:blipFill>
+                  <pic:spPr>
+                    <a:xfrm>
+                      <a:off x="0" y="0"/>
+                      <a:ext cx="6858000" cy="2808605"/>
+                    </a:xfrm>
+                    <a:prstGeom prst="rect">
+                      <a:avLst/>
+                    </a:prstGeom>
+                  </pic:spPr>
+                </pic:pic>
+              </a:graphicData>
+            </a:graphic>
+          </wp:inline>
+        </w:drawing>
+      </w:r>
+    </w:p>
+    <w:p>
+      <w:r>
+        <w:t xml:space="preserve">After Ahmed replied, two other incidents </w:t>
+      </w:r>
+      <w:proofErr w:type="gramStart"/>
+      <w:r>
+        <w:t>are</w:t>
+      </w:r>
+      <w:proofErr w:type="gramEnd"/>
+      <w:r>
+        <w:t xml:space="preserve"> raised from two another </w:t>
+      </w:r>
+      <w:proofErr w:type="gramStart"/>
+      <w:r>
+        <w:t>users</w:t>
+      </w:r>
+      <w:proofErr w:type="gramEnd"/>
+      <w:r>
+        <w:br/>
+      </w:r>
+      <w:r>
+        <w:drawing>
+          <wp:inline distT="0" distB="0" distL="0" distR="0" wp14:anchorId="37815CFD" wp14:editId="777A7283">
+            <wp:extent cx="6858000" cy="471805"/>
+            <wp:effectExtent l="0" t="0" r="0" b="4445"/>
+            <wp:docPr id="1918345513" name="Picture 1"/>
+            <wp:cNvGraphicFramePr>
+              <a:graphicFrameLocks xmlns:a="http://schemas.openxmlformats.org/drawingml/2006/main" noChangeAspect="1"/>
+            </wp:cNvGraphicFramePr>
+            <a:graphic xmlns:a="http://schemas.openxmlformats.org/drawingml/2006/main">
+              <a:graphicData uri="http://schemas.openxmlformats.org/drawingml/2006/picture">
+                <pic:pic xmlns:pic="http://schemas.openxmlformats.org/drawingml/2006/picture">
+                  <pic:nvPicPr>
+                    <pic:cNvPr id="1918345513" name=""/>
+                    <pic:cNvPicPr/>
+                  </pic:nvPicPr>
+                  <pic:blipFill>
+                    <a:blip r:embed="rId24"/>
+                    <a:stretch>
+                      <a:fillRect/>
+                    </a:stretch>
+                  </pic:blipFill>
+                  <pic:spPr>
+                    <a:xfrm>
+                      <a:off x="0" y="0"/>
+                      <a:ext cx="6858000" cy="471805"/>
+                    </a:xfrm>
+                    <a:prstGeom prst="rect">
+                      <a:avLst/>
+                    </a:prstGeom>
+                  </pic:spPr>
+                </pic:pic>
+              </a:graphicData>
+            </a:graphic>
+          </wp:inline>
+        </w:drawing>
+      </w:r>
+    </w:p>
+    <w:p/>
+    <w:p/>
+    <w:p/>
+    <w:p/>
+    <w:p/>
+    <w:p>
+      <w:r>
+        <w:br/>
+        <w:t>After multiple incidents were created then a problem being raised</w:t>
+      </w:r>
+      <w:r>
+        <w:br/>
+      </w:r>
+      <w:r>
+        <w:drawing>
+          <wp:inline distT="0" distB="0" distL="0" distR="0" wp14:anchorId="1D1E8621" wp14:editId="42F8DE39">
+            <wp:extent cx="6858000" cy="5673725"/>
+            <wp:effectExtent l="0" t="0" r="0" b="3175"/>
+            <wp:docPr id="771709237" name="Picture 1"/>
+            <wp:cNvGraphicFramePr>
+              <a:graphicFrameLocks xmlns:a="http://schemas.openxmlformats.org/drawingml/2006/main" noChangeAspect="1"/>
+            </wp:cNvGraphicFramePr>
+            <a:graphic xmlns:a="http://schemas.openxmlformats.org/drawingml/2006/main">
+              <a:graphicData uri="http://schemas.openxmlformats.org/drawingml/2006/picture">
+                <pic:pic xmlns:pic="http://schemas.openxmlformats.org/drawingml/2006/picture">
+                  <pic:nvPicPr>
+                    <pic:cNvPr id="771709237" name=""/>
+                    <pic:cNvPicPr/>
+                  </pic:nvPicPr>
+                  <pic:blipFill>
+                    <a:blip r:embed="rId25"/>
+                    <a:stretch>
+                      <a:fillRect/>
+                    </a:stretch>
+                  </pic:blipFill>
+                  <pic:spPr>
+                    <a:xfrm>
+                      <a:off x="0" y="0"/>
+                      <a:ext cx="6858000" cy="5673725"/>
+                    </a:xfrm>
+                    <a:prstGeom prst="rect">
+                      <a:avLst/>
+                    </a:prstGeom>
+                  </pic:spPr>
+                </pic:pic>
+              </a:graphicData>
+            </a:graphic>
+          </wp:inline>
+        </w:drawing>
+      </w:r>
+      <w:r>
+        <w:br/>
+      </w:r>
+      <w:r>
+        <w:br/>
+      </w:r>
+    </w:p>
+    <w:p/>
+    <w:p/>
+    <w:p/>
+    <w:p/>
+    <w:p/>
+    <w:p>
+      <w:r>
+        <w:lastRenderedPageBreak/>
+        <w:t xml:space="preserve">Since this action could </w:t>
+      </w:r>
+      <w:r>
+        <w:t>impact on</w:t>
+      </w:r>
+      <w:r>
+        <w:t xml:space="preserve"> the restaurant operations, they created a Change Request to safely perform the fix.</w:t>
+      </w:r>
+      <w:r>
+        <w:t xml:space="preserve"> And the problem added to it</w:t>
+      </w:r>
+    </w:p>
+    <w:p>
+      <w:r>
+        <w:rPr>
+          <w:noProof/>
+        </w:rPr>
+        <w:drawing>
+          <wp:inline distT="0" distB="0" distL="0" distR="0" wp14:anchorId="365789B0" wp14:editId="6307A811">
+            <wp:extent cx="6858000" cy="3299460"/>
+            <wp:effectExtent l="0" t="0" r="0" b="0"/>
+            <wp:docPr id="1660788893" name="Picture 1"/>
+            <wp:cNvGraphicFramePr>
+              <a:graphicFrameLocks xmlns:a="http://schemas.openxmlformats.org/drawingml/2006/main" noChangeAspect="1"/>
+            </wp:cNvGraphicFramePr>
+            <a:graphic xmlns:a="http://schemas.openxmlformats.org/drawingml/2006/main">
+              <a:graphicData uri="http://schemas.openxmlformats.org/drawingml/2006/picture">
+                <pic:pic xmlns:pic="http://schemas.openxmlformats.org/drawingml/2006/picture">
+                  <pic:nvPicPr>
+                    <pic:cNvPr id="1660788893" name=""/>
+                    <pic:cNvPicPr/>
+                  </pic:nvPicPr>
+                  <pic:blipFill>
+                    <a:blip r:embed="rId26"/>
+                    <a:stretch>
+                      <a:fillRect/>
+                    </a:stretch>
+                  </pic:blipFill>
+                  <pic:spPr>
+                    <a:xfrm>
+                      <a:off x="0" y="0"/>
+                      <a:ext cx="6858000" cy="3299460"/>
+                    </a:xfrm>
+                    <a:prstGeom prst="rect">
+                      <a:avLst/>
+                    </a:prstGeom>
+                  </pic:spPr>
+                </pic:pic>
+              </a:graphicData>
+            </a:graphic>
+          </wp:inline>
+        </w:drawing>
+      </w:r>
+    </w:p>
+    <w:p>
+      <w:r>
+        <w:t>Requested approval from Beth</w:t>
+      </w:r>
+    </w:p>
+    <w:p>
+      <w:r>
+        <w:drawing>
+          <wp:inline distT="0" distB="0" distL="0" distR="0" wp14:anchorId="48CB45CA" wp14:editId="0961F190">
+            <wp:extent cx="6858000" cy="2312035"/>
+            <wp:effectExtent l="0" t="0" r="0" b="0"/>
+            <wp:docPr id="1332727949" name="Picture 1"/>
+            <wp:cNvGraphicFramePr>
+              <a:graphicFrameLocks xmlns:a="http://schemas.openxmlformats.org/drawingml/2006/main" noChangeAspect="1"/>
+            </wp:cNvGraphicFramePr>
+            <a:graphic xmlns:a="http://schemas.openxmlformats.org/drawingml/2006/main">
+              <a:graphicData uri="http://schemas.openxmlformats.org/drawingml/2006/picture">
+                <pic:pic xmlns:pic="http://schemas.openxmlformats.org/drawingml/2006/picture">
+                  <pic:nvPicPr>
+                    <pic:cNvPr id="1332727949" name=""/>
+                    <pic:cNvPicPr/>
+                  </pic:nvPicPr>
+                  <pic:blipFill>
+                    <a:blip r:embed="rId27"/>
+                    <a:stretch>
+                      <a:fillRect/>
+                    </a:stretch>
+                  </pic:blipFill>
+                  <pic:spPr>
+                    <a:xfrm>
+                      <a:off x="0" y="0"/>
+                      <a:ext cx="6858000" cy="2312035"/>
+                    </a:xfrm>
+                    <a:prstGeom prst="rect">
+                      <a:avLst/>
+                    </a:prstGeom>
+                  </pic:spPr>
+                </pic:pic>
+              </a:graphicData>
+            </a:graphic>
+          </wp:inline>
+        </w:drawing>
+      </w:r>
+    </w:p>
+    <w:p/>
+    <w:p/>
+    <w:p>
+      <w:pPr>
+        <w:tabs>
+          <w:tab w:val="left" w:pos="1590"/>
+        </w:tabs>
+      </w:pPr>
+      <w:r>
+        <w:tab/>
+      </w:r>
+    </w:p>
     <w:sectPr>
-      <w:footerReference w:type="default" r:id="rId20"/>
+      <w:footerReference w:type="default" r:id="rId28"/>
       <w:pgSz w:w="12240" w:h="15840"/>
       <w:pgMar w:top="720" w:right="720" w:bottom="720" w:left="720" w:header="720" w:footer="792" w:gutter="0"/>
       <w:cols w:space="720"/>

</xml_diff>